<commit_message>
Refactor code structure and remove redundant changes
</commit_message>
<xml_diff>
--- a/Øvelser/Geografi/konvektionskammer-med-opgaver/index.docx
+++ b/Øvelser/Geografi/konvektionskammer-med-opgaver/index.docx
@@ -936,7 +936,7 @@
         <w:sz w:val="16"/>
         <w:szCs w:val="16"/>
       </w:rPr>
-      <w:t xml:space="preserve">NATURGEOGRAFI B</w:t>
+      <w:t xml:space="preserve"/>
     </w:r>
     <w:r>
       <w:rPr>
@@ -952,7 +952,7 @@
         <w:sz w:val="16"/>
         <w:szCs w:val="16"/>
       </w:rPr>
-      <w:t xml:space="preserve">3g Ng</w:t>
+      <w:t xml:space="preserve"/>
     </w:r>
   </w:p>
 </w:hdr>

</xml_diff>